<commit_message>
Export report in A4 PDF format
Co-authored-by: kid2226 <kid2226@users.noreply.github.com>
</commit_message>
<xml_diff>
--- a/output/china-real-estate-market-report-2026-2030.docx
+++ b/output/china-real-estate-market-report-2026-2030.docx
@@ -39,12 +39,12 @@
         <w:tblLook w:firstColumn="1" w:firstRow="1" w:lastColumn="0" w:lastRow="0" w:noHBand="0" w:noVBand="1" w:val="04A0"/>
       </w:tblPr>
       <w:tblGrid>
-        <w:gridCol w:w="9859"/>
+        <w:gridCol w:w="9525"/>
       </w:tblGrid>
       <w:tr>
         <w:tc>
           <w:tcPr>
-            <w:tcW w:type="dxa" w:w="9859"/>
+            <w:tcW w:type="dxa" w:w="9525"/>
             <w:shd w:fill="2F75B5"/>
             <w:tcMar>
               <w:top w:w="0" w:type="dxa"/>
@@ -96,12 +96,12 @@
         </w:tblBorders>
       </w:tblPr>
       <w:tblGrid>
-        <w:gridCol w:w="9859"/>
+        <w:gridCol w:w="9525"/>
       </w:tblGrid>
       <w:tr>
         <w:tc>
           <w:tcPr>
-            <w:tcW w:type="dxa" w:w="9859"/>
+            <w:tcW w:type="dxa" w:w="9525"/>
             <w:shd w:fill="EAF2F8"/>
             <w:tcMar>
               <w:top w:w="140" w:type="dxa"/>
@@ -237,12 +237,12 @@
         </w:tblBorders>
       </w:tblPr>
       <w:tblGrid>
-        <w:gridCol w:w="9859"/>
+        <w:gridCol w:w="9525"/>
       </w:tblGrid>
       <w:tr>
         <w:tc>
           <w:tcPr>
-            <w:tcW w:type="dxa" w:w="9859"/>
+            <w:tcW w:type="dxa" w:w="9525"/>
             <w:shd w:fill="DCEAF7"/>
             <w:tcMar>
               <w:top w:w="140" w:type="dxa"/>
@@ -367,10 +367,10 @@
         </w:tblBorders>
       </w:tblPr>
       <w:tblGrid>
-        <w:gridCol w:w="2465"/>
-        <w:gridCol w:w="2465"/>
-        <w:gridCol w:w="2465"/>
-        <w:gridCol w:w="2465"/>
+        <w:gridCol w:w="2381"/>
+        <w:gridCol w:w="2381"/>
+        <w:gridCol w:w="2381"/>
+        <w:gridCol w:w="2381"/>
       </w:tblGrid>
       <w:tr>
         <w:trPr>
@@ -1225,10 +1225,10 @@
         </w:tblBorders>
       </w:tblPr>
       <w:tblGrid>
-        <w:gridCol w:w="2465"/>
-        <w:gridCol w:w="2465"/>
-        <w:gridCol w:w="2465"/>
-        <w:gridCol w:w="2465"/>
+        <w:gridCol w:w="2381"/>
+        <w:gridCol w:w="2381"/>
+        <w:gridCol w:w="2381"/>
+        <w:gridCol w:w="2381"/>
       </w:tblGrid>
       <w:tr>
         <w:trPr>
@@ -1872,10 +1872,10 @@
         </w:tblBorders>
       </w:tblPr>
       <w:tblGrid>
-        <w:gridCol w:w="2465"/>
-        <w:gridCol w:w="2465"/>
-        <w:gridCol w:w="2465"/>
-        <w:gridCol w:w="2465"/>
+        <w:gridCol w:w="2381"/>
+        <w:gridCol w:w="2381"/>
+        <w:gridCol w:w="2381"/>
+        <w:gridCol w:w="2381"/>
       </w:tblGrid>
       <w:tr>
         <w:trPr>
@@ -2522,9 +2522,9 @@
         </w:tblBorders>
       </w:tblPr>
       <w:tblGrid>
-        <w:gridCol w:w="3286"/>
-        <w:gridCol w:w="3286"/>
-        <w:gridCol w:w="3286"/>
+        <w:gridCol w:w="3175"/>
+        <w:gridCol w:w="3175"/>
+        <w:gridCol w:w="3175"/>
       </w:tblGrid>
       <w:tr>
         <w:trPr>
@@ -2872,10 +2872,10 @@
         </w:tblBorders>
       </w:tblPr>
       <w:tblGrid>
-        <w:gridCol w:w="2465"/>
-        <w:gridCol w:w="2465"/>
-        <w:gridCol w:w="2465"/>
-        <w:gridCol w:w="2465"/>
+        <w:gridCol w:w="2381"/>
+        <w:gridCol w:w="2381"/>
+        <w:gridCol w:w="2381"/>
+        <w:gridCol w:w="2381"/>
       </w:tblGrid>
       <w:tr>
         <w:trPr>
@@ -3640,12 +3640,12 @@
         </w:tblBorders>
       </w:tblPr>
       <w:tblGrid>
-        <w:gridCol w:w="9859"/>
+        <w:gridCol w:w="9525"/>
       </w:tblGrid>
       <w:tr>
         <w:tc>
           <w:tcPr>
-            <w:tcW w:type="dxa" w:w="9859"/>
+            <w:tcW w:type="dxa" w:w="9525"/>
             <w:shd w:fill="DCEAF7"/>
             <w:tcMar>
               <w:top w:w="140" w:type="dxa"/>
@@ -3776,10 +3776,10 @@
         </w:tblBorders>
       </w:tblPr>
       <w:tblGrid>
-        <w:gridCol w:w="2465"/>
-        <w:gridCol w:w="2465"/>
-        <w:gridCol w:w="2465"/>
-        <w:gridCol w:w="2465"/>
+        <w:gridCol w:w="2381"/>
+        <w:gridCol w:w="2381"/>
+        <w:gridCol w:w="2381"/>
+        <w:gridCol w:w="2381"/>
       </w:tblGrid>
       <w:tr>
         <w:trPr>
@@ -4426,11 +4426,11 @@
         </w:tblBorders>
       </w:tblPr>
       <w:tblGrid>
-        <w:gridCol w:w="1972"/>
-        <w:gridCol w:w="1972"/>
-        <w:gridCol w:w="1972"/>
-        <w:gridCol w:w="1972"/>
-        <w:gridCol w:w="1972"/>
+        <w:gridCol w:w="1905"/>
+        <w:gridCol w:w="1905"/>
+        <w:gridCol w:w="1905"/>
+        <w:gridCol w:w="1905"/>
+        <w:gridCol w:w="1905"/>
       </w:tblGrid>
       <w:tr>
         <w:trPr>
@@ -5308,10 +5308,10 @@
         </w:tblBorders>
       </w:tblPr>
       <w:tblGrid>
-        <w:gridCol w:w="2465"/>
-        <w:gridCol w:w="2465"/>
-        <w:gridCol w:w="2465"/>
-        <w:gridCol w:w="2465"/>
+        <w:gridCol w:w="2381"/>
+        <w:gridCol w:w="2381"/>
+        <w:gridCol w:w="2381"/>
+        <w:gridCol w:w="2381"/>
       </w:tblGrid>
       <w:tr>
         <w:trPr>
@@ -5963,10 +5963,10 @@
         </w:tblBorders>
       </w:tblPr>
       <w:tblGrid>
-        <w:gridCol w:w="2465"/>
-        <w:gridCol w:w="2465"/>
-        <w:gridCol w:w="2465"/>
-        <w:gridCol w:w="2465"/>
+        <w:gridCol w:w="2381"/>
+        <w:gridCol w:w="2381"/>
+        <w:gridCol w:w="2381"/>
+        <w:gridCol w:w="2381"/>
       </w:tblGrid>
       <w:tr>
         <w:trPr>
@@ -6605,10 +6605,10 @@
         </w:tblBorders>
       </w:tblPr>
       <w:tblGrid>
-        <w:gridCol w:w="2465"/>
-        <w:gridCol w:w="2465"/>
-        <w:gridCol w:w="2465"/>
-        <w:gridCol w:w="2465"/>
+        <w:gridCol w:w="2381"/>
+        <w:gridCol w:w="2381"/>
+        <w:gridCol w:w="2381"/>
+        <w:gridCol w:w="2381"/>
       </w:tblGrid>
       <w:tr>
         <w:trPr>
@@ -7630,10 +7630,10 @@
         </w:tblBorders>
       </w:tblPr>
       <w:tblGrid>
-        <w:gridCol w:w="2465"/>
-        <w:gridCol w:w="2465"/>
-        <w:gridCol w:w="2465"/>
-        <w:gridCol w:w="2465"/>
+        <w:gridCol w:w="2381"/>
+        <w:gridCol w:w="2381"/>
+        <w:gridCol w:w="2381"/>
+        <w:gridCol w:w="2381"/>
       </w:tblGrid>
       <w:tr>
         <w:trPr>
@@ -8173,12 +8173,12 @@
         </w:tblBorders>
       </w:tblPr>
       <w:tblGrid>
-        <w:gridCol w:w="9859"/>
+        <w:gridCol w:w="9525"/>
       </w:tblGrid>
       <w:tr>
         <w:tc>
           <w:tcPr>
-            <w:tcW w:type="dxa" w:w="9859"/>
+            <w:tcW w:type="dxa" w:w="9525"/>
             <w:shd w:fill="DCEAF7"/>
             <w:tcMar>
               <w:top w:w="140" w:type="dxa"/>
@@ -8235,12 +8235,12 @@
         </w:tblBorders>
       </w:tblPr>
       <w:tblGrid>
-        <w:gridCol w:w="9859"/>
+        <w:gridCol w:w="9525"/>
       </w:tblGrid>
       <w:tr>
         <w:tc>
           <w:tcPr>
-            <w:tcW w:type="dxa" w:w="9859"/>
+            <w:tcW w:type="dxa" w:w="9525"/>
             <w:shd w:fill="DCEAF7"/>
             <w:tcMar>
               <w:top w:w="140" w:type="dxa"/>
@@ -8366,9 +8366,9 @@
         </w:tblBorders>
       </w:tblPr>
       <w:tblGrid>
-        <w:gridCol w:w="3286"/>
-        <w:gridCol w:w="3286"/>
-        <w:gridCol w:w="3286"/>
+        <w:gridCol w:w="3175"/>
+        <w:gridCol w:w="3175"/>
+        <w:gridCol w:w="3175"/>
       </w:tblGrid>
       <w:tr>
         <w:trPr>
@@ -8785,9 +8785,9 @@
         </w:tblBorders>
       </w:tblPr>
       <w:tblGrid>
-        <w:gridCol w:w="3286"/>
-        <w:gridCol w:w="3286"/>
-        <w:gridCol w:w="3286"/>
+        <w:gridCol w:w="3175"/>
+        <w:gridCol w:w="3175"/>
+        <w:gridCol w:w="3175"/>
       </w:tblGrid>
       <w:tr>
         <w:trPr>
@@ -9214,12 +9214,12 @@
         </w:tblBorders>
       </w:tblPr>
       <w:tblGrid>
-        <w:gridCol w:w="9859"/>
+        <w:gridCol w:w="9525"/>
       </w:tblGrid>
       <w:tr>
         <w:tc>
           <w:tcPr>
-            <w:tcW w:type="dxa" w:w="9859"/>
+            <w:tcW w:type="dxa" w:w="9525"/>
             <w:shd w:fill="DCEAF7"/>
             <w:tcMar>
               <w:top w:w="140" w:type="dxa"/>
@@ -9345,9 +9345,9 @@
         </w:tblBorders>
       </w:tblPr>
       <w:tblGrid>
-        <w:gridCol w:w="3286"/>
-        <w:gridCol w:w="3286"/>
-        <w:gridCol w:w="3286"/>
+        <w:gridCol w:w="3175"/>
+        <w:gridCol w:w="3175"/>
+        <w:gridCol w:w="3175"/>
       </w:tblGrid>
       <w:tr>
         <w:trPr>
@@ -9764,9 +9764,9 @@
         </w:tblBorders>
       </w:tblPr>
       <w:tblGrid>
-        <w:gridCol w:w="3286"/>
-        <w:gridCol w:w="3286"/>
-        <w:gridCol w:w="3286"/>
+        <w:gridCol w:w="3175"/>
+        <w:gridCol w:w="3175"/>
+        <w:gridCol w:w="3175"/>
       </w:tblGrid>
       <w:tr>
         <w:trPr>
@@ -10193,12 +10193,12 @@
         </w:tblBorders>
       </w:tblPr>
       <w:tblGrid>
-        <w:gridCol w:w="9859"/>
+        <w:gridCol w:w="9525"/>
       </w:tblGrid>
       <w:tr>
         <w:tc>
           <w:tcPr>
-            <w:tcW w:type="dxa" w:w="9859"/>
+            <w:tcW w:type="dxa" w:w="9525"/>
             <w:shd w:fill="DCEAF7"/>
             <w:tcMar>
               <w:top w:w="140" w:type="dxa"/>
@@ -10324,9 +10324,9 @@
         </w:tblBorders>
       </w:tblPr>
       <w:tblGrid>
-        <w:gridCol w:w="3286"/>
-        <w:gridCol w:w="3286"/>
-        <w:gridCol w:w="3286"/>
+        <w:gridCol w:w="3175"/>
+        <w:gridCol w:w="3175"/>
+        <w:gridCol w:w="3175"/>
       </w:tblGrid>
       <w:tr>
         <w:trPr>
@@ -10743,9 +10743,9 @@
         </w:tblBorders>
       </w:tblPr>
       <w:tblGrid>
-        <w:gridCol w:w="3286"/>
-        <w:gridCol w:w="3286"/>
-        <w:gridCol w:w="3286"/>
+        <w:gridCol w:w="3175"/>
+        <w:gridCol w:w="3175"/>
+        <w:gridCol w:w="3175"/>
       </w:tblGrid>
       <w:tr>
         <w:trPr>
@@ -11172,12 +11172,12 @@
         </w:tblBorders>
       </w:tblPr>
       <w:tblGrid>
-        <w:gridCol w:w="9859"/>
+        <w:gridCol w:w="9525"/>
       </w:tblGrid>
       <w:tr>
         <w:tc>
           <w:tcPr>
-            <w:tcW w:type="dxa" w:w="9859"/>
+            <w:tcW w:type="dxa" w:w="9525"/>
             <w:shd w:fill="DCEAF7"/>
             <w:tcMar>
               <w:top w:w="140" w:type="dxa"/>
@@ -11303,9 +11303,9 @@
         </w:tblBorders>
       </w:tblPr>
       <w:tblGrid>
-        <w:gridCol w:w="3286"/>
-        <w:gridCol w:w="3286"/>
-        <w:gridCol w:w="3286"/>
+        <w:gridCol w:w="3175"/>
+        <w:gridCol w:w="3175"/>
+        <w:gridCol w:w="3175"/>
       </w:tblGrid>
       <w:tr>
         <w:trPr>
@@ -11722,9 +11722,9 @@
         </w:tblBorders>
       </w:tblPr>
       <w:tblGrid>
-        <w:gridCol w:w="3286"/>
-        <w:gridCol w:w="3286"/>
-        <w:gridCol w:w="3286"/>
+        <w:gridCol w:w="3175"/>
+        <w:gridCol w:w="3175"/>
+        <w:gridCol w:w="3175"/>
       </w:tblGrid>
       <w:tr>
         <w:trPr>
@@ -12160,9 +12160,9 @@
         </w:tblBorders>
       </w:tblPr>
       <w:tblGrid>
-        <w:gridCol w:w="3286"/>
-        <w:gridCol w:w="3286"/>
-        <w:gridCol w:w="3286"/>
+        <w:gridCol w:w="3175"/>
+        <w:gridCol w:w="3175"/>
+        <w:gridCol w:w="3175"/>
       </w:tblGrid>
       <w:tr>
         <w:trPr>
@@ -12653,10 +12653,10 @@
         </w:tblBorders>
       </w:tblPr>
       <w:tblGrid>
-        <w:gridCol w:w="2465"/>
-        <w:gridCol w:w="2465"/>
-        <w:gridCol w:w="2465"/>
-        <w:gridCol w:w="2465"/>
+        <w:gridCol w:w="2381"/>
+        <w:gridCol w:w="2381"/>
+        <w:gridCol w:w="2381"/>
+        <w:gridCol w:w="2381"/>
       </w:tblGrid>
       <w:tr>
         <w:trPr>
@@ -13508,9 +13508,9 @@
         </w:tblBorders>
       </w:tblPr>
       <w:tblGrid>
-        <w:gridCol w:w="3286"/>
-        <w:gridCol w:w="3286"/>
-        <w:gridCol w:w="3286"/>
+        <w:gridCol w:w="3175"/>
+        <w:gridCol w:w="3175"/>
+        <w:gridCol w:w="3175"/>
       </w:tblGrid>
       <w:tr>
         <w:trPr>
@@ -14327,11 +14327,11 @@
         </w:tblBorders>
       </w:tblPr>
       <w:tblGrid>
-        <w:gridCol w:w="1972"/>
-        <w:gridCol w:w="1972"/>
-        <w:gridCol w:w="1972"/>
-        <w:gridCol w:w="1972"/>
-        <w:gridCol w:w="1972"/>
+        <w:gridCol w:w="1905"/>
+        <w:gridCol w:w="1905"/>
+        <w:gridCol w:w="1905"/>
+        <w:gridCol w:w="1905"/>
+        <w:gridCol w:w="1905"/>
       </w:tblGrid>
       <w:tr>
         <w:trPr>
@@ -15342,12 +15342,12 @@
         </w:tblBorders>
       </w:tblPr>
       <w:tblGrid>
-        <w:gridCol w:w="9859"/>
+        <w:gridCol w:w="9525"/>
       </w:tblGrid>
       <w:tr>
         <w:tc>
           <w:tcPr>
-            <w:tcW w:type="dxa" w:w="9859"/>
+            <w:tcW w:type="dxa" w:w="9525"/>
             <w:shd w:fill="DCEAF7"/>
             <w:tcMar>
               <w:top w:w="140" w:type="dxa"/>
@@ -15863,8 +15863,8 @@
         </w:tblBorders>
       </w:tblPr>
       <w:tblGrid>
-        <w:gridCol w:w="4929"/>
-        <w:gridCol w:w="4929"/>
+        <w:gridCol w:w="4762"/>
+        <w:gridCol w:w="4762"/>
       </w:tblGrid>
       <w:tr>
         <w:trPr>
@@ -16340,7 +16340,7 @@
     <w:sectPr>
       <w:headerReference w:type="default" r:id="rId9"/>
       <w:footerReference w:type="default" r:id="rId10"/>
-      <w:pgSz w:w="12240" w:h="15840"/>
+      <w:pgSz w:w="11906" w:h="16838"/>
       <w:pgMar w:top="1219" w:right="1134" w:bottom="1077" w:left="1247" w:header="454" w:footer="454" w:gutter="0"/>
       <w:cols w:space="720"/>
       <w:docGrid w:linePitch="360"/>

</xml_diff>